<commit_message>
:sparkles: Improve sample documents with contextual figures
Replace generic thumbnails with high-resolution diagrams beside the
clauses they illustrate. Keep service, acceptance, payment and incident
response examples consistent with the contract text and tables while
preserving all four image comparison outcomes.

Regenerate figures from contract data and preserve shared image resources
after Word/WPS saves. Update sample documentation and browser checks for
figure placement, resolution and comparison behavior.
</commit_message>
<xml_diff>
--- a/public/samples/baseline.docx
+++ b/public/samples/baseline.docx
@@ -334,6 +334,68 @@
     </w:p>
     <w:p>
       <w:pPr>
+        <w:spacing w:after="60"/>
+        <w:jc w:val="center"/>
+        <w:rPr>
+          <w:color w:val="657187"/>
+          <w:sz w:val="18"/>
+        </w:rPr>
+      </w:pPr>
+      <w:bookmarkStart w:id="0" w:name="DDPSample_6000"/>
+      <w:r>
+        <w:rPr>
+          <w:color w:val="657187"/>
+          <w:sz w:val="18"/>
+        </w:rPr>
+        <w:t>核心服务链路如下，所有环节均受权限管理控制。</w:t>
+      </w:r>
+      <w:bookmarkEnd w:id="0"/>
+    </w:p>
+    <w:p>
+      <w:pPr>
+        <w:spacing w:before="120" w:after="200"/>
+        <w:jc w:val="center"/>
+      </w:pPr>
+      <w:bookmarkStart w:id="1" w:name="DDPSample_6001"/>
+      <w:r>
+        <w:drawing>
+          <wp:inline distT="0" distB="0" distL="0" distR="0">
+            <wp:extent cx="5334000" cy="2609850"/>
+            <wp:effectExtent l="0" t="0" r="0" b="6350"/>
+            <wp:docPr id="1600" name="核心审阅链路" descr="第一条服务范围：文档上传、版本比对和审阅记录由权限管理控制，部署于中国大陆境内的甲方私有云。"/>
+            <wp:cNvGraphicFramePr/>
+            <a:graphic xmlns:a="http://schemas.openxmlformats.org/drawingml/2006/main">
+              <a:graphicData uri="http://schemas.openxmlformats.org/drawingml/2006/picture">
+                <pic:pic xmlns:pic="http://schemas.openxmlformats.org/drawingml/2006/picture">
+                  <pic:nvPicPr>
+                    <pic:cNvPr id="1600" name="核心审阅链路" descr="第一条服务范围：文档上传、版本比对和审阅记录由权限管理控制，部署于中国大陆境内的甲方私有云。"/>
+                    <pic:cNvPicPr/>
+                  </pic:nvPicPr>
+                  <pic:blipFill>
+                    <a:blip r:embed="rId8"/>
+                    <a:stretch>
+                      <a:fillRect/>
+                    </a:stretch>
+                  </pic:blipFill>
+                  <pic:spPr>
+                    <a:xfrm>
+                      <a:off x="0" y="0"/>
+                      <a:ext cx="5334000" cy="2609850"/>
+                    </a:xfrm>
+                    <a:prstGeom prst="rect">
+                      <a:avLst/>
+                    </a:prstGeom>
+                  </pic:spPr>
+                </pic:pic>
+              </a:graphicData>
+            </a:graphic>
+          </wp:inline>
+        </w:drawing>
+      </w:r>
+      <w:bookmarkEnd w:id="1"/>
+    </w:p>
+    <w:p>
+      <w:pPr>
         <w:pStyle w:val="3"/>
         <w:keepNext/>
         <w:spacing w:before="260" w:after="100"/>
@@ -386,6 +448,68 @@
       <w:r>
         <w:t>甲方逾期未提出书面异议的，视为本阶段交付物通过验收。</w:t>
       </w:r>
+    </w:p>
+    <w:p>
+      <w:pPr>
+        <w:spacing w:after="60"/>
+        <w:jc w:val="center"/>
+        <w:rPr>
+          <w:color w:val="657187"/>
+          <w:sz w:val="18"/>
+        </w:rPr>
+      </w:pPr>
+      <w:bookmarkStart w:id="2" w:name="DDPSample_6002"/>
+      <w:r>
+        <w:rPr>
+          <w:color w:val="657187"/>
+          <w:sz w:val="18"/>
+        </w:rPr>
+        <w:t>阶段验收流程如下，时限自收到交付物起算。</w:t>
+      </w:r>
+      <w:bookmarkEnd w:id="2"/>
+    </w:p>
+    <w:p>
+      <w:pPr>
+        <w:spacing w:before="120" w:after="200"/>
+        <w:jc w:val="center"/>
+      </w:pPr>
+      <w:bookmarkStart w:id="3" w:name="DDPSample_6003"/>
+      <w:r>
+        <w:drawing>
+          <wp:inline distT="0" distB="0" distL="0" distR="0">
+            <wp:extent cx="5334000" cy="3028950"/>
+            <wp:effectExtent l="0" t="0" r="0" b="19050"/>
+            <wp:docPr id="1601" name="阶段交付与验收" descr="基准合同第二条：甲方收到交付物后 7 个工作日内完成验收。有书面异议时一次性反馈问题清单；逾期未提出书面异议则视为本阶段交付物通过验收。"/>
+            <wp:cNvGraphicFramePr/>
+            <a:graphic xmlns:a="http://schemas.openxmlformats.org/drawingml/2006/main">
+              <a:graphicData uri="http://schemas.openxmlformats.org/drawingml/2006/picture">
+                <pic:pic xmlns:pic="http://schemas.openxmlformats.org/drawingml/2006/picture">
+                  <pic:nvPicPr>
+                    <pic:cNvPr id="1601" name="阶段交付与验收" descr="基准合同第二条：甲方收到交付物后 7 个工作日内完成验收。有书面异议时一次性反馈问题清单；逾期未提出书面异议则视为本阶段交付物通过验收。"/>
+                    <pic:cNvPicPr/>
+                  </pic:nvPicPr>
+                  <pic:blipFill>
+                    <a:blip r:embed="rId9"/>
+                    <a:stretch>
+                      <a:fillRect/>
+                    </a:stretch>
+                  </pic:blipFill>
+                  <pic:spPr>
+                    <a:xfrm>
+                      <a:off x="0" y="0"/>
+                      <a:ext cx="5334000" cy="3028950"/>
+                    </a:xfrm>
+                    <a:prstGeom prst="rect">
+                      <a:avLst/>
+                    </a:prstGeom>
+                  </pic:spPr>
+                </pic:pic>
+              </a:graphicData>
+            </a:graphic>
+          </wp:inline>
+        </w:drawing>
+      </w:r>
+      <w:bookmarkEnd w:id="3"/>
     </w:p>
     <w:p>
       <w:pPr>
@@ -752,6 +876,102 @@
     </w:tbl>
     <w:p>
       <w:pPr>
+        <w:spacing w:after="60"/>
+        <w:jc w:val="center"/>
+        <w:rPr>
+          <w:color w:val="657187"/>
+          <w:sz w:val="18"/>
+        </w:rPr>
+      </w:pPr>
+      <w:bookmarkStart w:id="4" w:name="DDPSample_6004"/>
+      <w:r>
+        <w:rPr>
+          <w:color w:val="657187"/>
+          <w:sz w:val="18"/>
+        </w:rPr>
+        <w:t>下图金额及比例与本条付款表一致，金额单位为人民币万元。</w:t>
+      </w:r>
+      <w:bookmarkEnd w:id="4"/>
+    </w:p>
+    <w:p>
+      <w:pPr>
+        <w:spacing w:before="120" w:after="200"/>
+        <w:jc w:val="center"/>
+      </w:pPr>
+      <w:bookmarkStart w:id="5" w:name="DDPSample_6005"/>
+      <w:r>
+        <w:drawing>
+          <wp:inline distT="0" distB="0" distL="0" distR="0">
+            <wp:extent cx="5334000" cy="3486150"/>
+            <wp:effectExtent l="0" t="0" r="0" b="19050"/>
+            <wp:docPr id="1602" name="付款计划" descr="付款计划：含税合同总额 1000000 元；预付款 30%，300000 元；上线款 50%，500000 元；质保款 20%，200000 元"/>
+            <wp:cNvGraphicFramePr/>
+            <a:graphic xmlns:a="http://schemas.openxmlformats.org/drawingml/2006/main">
+              <a:graphicData uri="http://schemas.openxmlformats.org/drawingml/2006/picture">
+                <pic:pic xmlns:pic="http://schemas.openxmlformats.org/drawingml/2006/picture">
+                  <pic:nvPicPr>
+                    <pic:cNvPr id="1602" name="付款计划" descr="付款计划：含税合同总额 1000000 元；预付款 30%，300000 元；上线款 50%，500000 元；质保款 20%，200000 元"/>
+                    <pic:cNvPicPr/>
+                  </pic:nvPicPr>
+                  <pic:blipFill>
+                    <a:blip r:embed="rId10"/>
+                    <a:stretch>
+                      <a:fillRect/>
+                    </a:stretch>
+                  </pic:blipFill>
+                  <pic:spPr>
+                    <a:xfrm>
+                      <a:off x="0" y="0"/>
+                      <a:ext cx="5334000" cy="3486150"/>
+                    </a:xfrm>
+                    <a:prstGeom prst="rect">
+                      <a:avLst/>
+                    </a:prstGeom>
+                  </pic:spPr>
+                </pic:pic>
+              </a:graphicData>
+            </a:graphic>
+          </wp:inline>
+        </w:drawing>
+      </w:r>
+      <w:bookmarkEnd w:id="5"/>
+    </w:p>
+    <w:p>
+      <w:pPr>
+        <w:spacing w:after="60"/>
+        <w:jc w:val="center"/>
+        <w:rPr>
+          <w:color w:val="657187"/>
+          <w:sz w:val="18"/>
+        </w:rPr>
+      </w:pPr>
+      <w:bookmarkStart w:id="6" w:name="DDPSample_6006"/>
+      <w:r>
+        <w:rPr>
+          <w:color w:val="657187"/>
+          <w:sz w:val="18"/>
+        </w:rPr>
+        <w:t>阶段付款金额按含税合同总额与对应付款比例的乘积计算。</w:t>
+      </w:r>
+      <w:bookmarkEnd w:id="6"/>
+    </w:p>
+    <w:p>
+      <w:pPr>
+        <w:jc w:val="center"/>
+      </w:pPr>
+      <w:bookmarkStart w:id="7" w:name="DDPSample_6007"/>
+      <m:oMathPara>
+        <m:oMath>
+          <m:r>
+            <m:rPr/>
+            <m:t>阶段付款金额 = 含税合同总额 × 付款比例</m:t>
+          </m:r>
+          <w:bookmarkEnd w:id="7"/>
+        </m:oMath>
+      </m:oMathPara>
+    </w:p>
+    <w:p>
+      <w:pPr>
         <w:spacing w:after="120"/>
         <w:jc w:val="both"/>
       </w:pPr>
@@ -1104,35 +1324,17 @@
           </w:p>
         </w:tc>
       </w:tr>
-    </w:tbl>
-    <w:tbl>
-      <w:tblPr>
-        <w:tblW w:w="9000" w:type="dxa"/>
-        <w:tblLayout w:type="fixed"/>
-        <w:tblBorders>
-          <w:top w:val="single" w:sz="6" w:color="A8B2C1"/>
-          <w:left w:val="single" w:sz="6" w:color="A8B2C1"/>
-          <w:bottom w:val="single" w:sz="6" w:color="A8B2C1"/>
-          <w:right w:val="single" w:sz="6" w:color="A8B2C1"/>
-          <w:insideH w:val="single" w:sz="6" w:color="CBD2DC"/>
-          <w:insideV w:val="single" w:sz="6" w:color="CBD2DC"/>
-        </w:tblBorders>
-        <w:tblCellMar>
-          <w:top w:w="90" w:type="dxa"/>
-          <w:left w:w="120" w:type="dxa"/>
-          <w:bottom w:w="90" w:type="dxa"/>
-          <w:right w:w="120" w:type="dxa"/>
-        </w:tblCellMar>
-      </w:tblPr>
-      <w:tblGrid>
-        <w:gridCol w:w="4500"/>
-        <w:gridCol w:w="4500"/>
-      </w:tblGrid>
       <w:tr>
+        <w:trPr>
+          <w:gridAfter w:val="1"/>
+          <w:wAfter w:w="2126" w:type="dxa"/>
+          <w:jc w:val="center"/>
+        </w:trPr>
         <w:tc>
           <w:tcPr>
             <w:tcW w:w="4500" w:type="dxa"/>
-            <w:shd w:fill="E8EEF8"/>
+            <w:gridSpan w:val="2"/>
+            <w:shd w:val="clear" w:color="auto" w:fill="E8EEF8"/>
             <w:vAlign w:val="center"/>
           </w:tcPr>
           <w:p>
@@ -1143,14 +1345,14 @@
               <w:rPr>
                 <w:b/>
               </w:rPr>
-              <w:t xml:space="preserve">甲方（盖章）</w:t>
+              <w:t>甲方（盖章）</w:t>
             </w:r>
           </w:p>
         </w:tc>
         <w:tc>
           <w:tcPr>
             <w:tcW w:w="4500" w:type="dxa"/>
-            <w:shd w:fill="E8EEF8"/>
+            <w:shd w:val="clear" w:color="auto" w:fill="E8EEF8"/>
             <w:vAlign w:val="center"/>
           </w:tcPr>
           <w:p>
@@ -1161,29 +1363,35 @@
               <w:rPr>
                 <w:b/>
               </w:rPr>
-              <w:t xml:space="preserve">乙方（盖章）</w:t>
+              <w:t>乙方（盖章）</w:t>
             </w:r>
           </w:p>
         </w:tc>
       </w:tr>
       <w:tr>
+        <w:trPr>
+          <w:gridAfter w:val="1"/>
+          <w:wAfter w:w="2126" w:type="dxa"/>
+          <w:jc w:val="center"/>
+        </w:trPr>
         <w:tc>
           <w:tcPr>
             <w:tcW w:w="4500" w:type="dxa"/>
-            <w:vAlign w:val="center"/>
-          </w:tcPr>
-          <w:p>
-            <w:pPr>
-              <w:spacing w:before="60" w:after="60"/>
-            </w:pPr>
-            <w:r>
-              <w:t xml:space="preserve">授权代表：</w:t>
-            </w:r>
-            <w:r>
-              <w:br/>
-            </w:r>
-            <w:r>
-              <w:t xml:space="preserve">签署日期：</w:t>
+            <w:gridSpan w:val="2"/>
+            <w:vAlign w:val="center"/>
+          </w:tcPr>
+          <w:p>
+            <w:pPr>
+              <w:spacing w:before="60" w:after="60"/>
+            </w:pPr>
+            <w:r>
+              <w:t>授权代表：</w:t>
+            </w:r>
+            <w:r>
+              <w:br w:type="textWrapping"/>
+            </w:r>
+            <w:r>
+              <w:t>签署日期：</w:t>
             </w:r>
           </w:p>
         </w:tc>
@@ -1197,283 +1405,107 @@
               <w:spacing w:before="60" w:after="60"/>
             </w:pPr>
             <w:r>
-              <w:t xml:space="preserve">授权代表：</w:t>
-            </w:r>
-            <w:r>
-              <w:br/>
-            </w:r>
-            <w:r>
-              <w:t xml:space="preserve">签署日期：</w:t>
+              <w:t>授权代表：</w:t>
+            </w:r>
+            <w:r>
+              <w:br w:type="textWrapping"/>
+            </w:r>
+            <w:r>
+              <w:t>签署日期：</w:t>
             </w:r>
           </w:p>
         </w:tc>
       </w:tr>
     </w:tbl>
-    <w:p>
-      <w:bookmarkStart w:id="0" w:name="_GoBack"/>
-      <w:bookmarkEnd w:id="0"/>
-    </w:p>
-    <w:p>
-      <w:pPr>
-        <w:pStyle w:val="Heading1"/>
-        <w:spacing w:before="360" w:after="160"/>
-      </w:pPr>
-      <w:r>
-        <w:t xml:space="preserve">附件一 图示</w:t>
-      </w:r>
-    </w:p>
-    <w:p>
-      <w:pPr>
+    <w:p/>
+    <w:p>
+      <w:pPr>
+        <w:spacing w:after="60"/>
         <w:jc w:val="center"/>
-        <w:spacing w:after="60"/>
         <w:rPr>
           <w:color w:val="657187"/>
           <w:sz w:val="18"/>
         </w:rPr>
       </w:pPr>
+      <w:bookmarkStart w:id="8" w:name="DDPSample_6008"/>
       <w:r>
         <w:rPr>
           <w:color w:val="657187"/>
           <w:sz w:val="18"/>
         </w:rPr>
-        <w:t xml:space="preserve">图 1 分季度交付量</w:t>
-      </w:r>
+        <w:t>履约资料归档说明</w:t>
+      </w:r>
+      <w:bookmarkEnd w:id="8"/>
     </w:p>
     <w:p>
       <w:pPr>
         <w:jc w:val="center"/>
-        <w:spacing w:before="120" w:after="200"/>
-      </w:pPr>
-      <w:r>
-        <w:drawing>
-          <wp:inline xmlns:wp="http://schemas.openxmlformats.org/drawingml/2006/wordprocessingDrawing" distT="0" distB="0" distL="0" distR="0">
-            <wp:extent cx="4572000" cy="2857500"/>
-            <wp:docPr id="1600" name="figure-quarterly.png"/>
-            <a:graphic xmlns:a="http://schemas.openxmlformats.org/drawingml/2006/main">
-              <a:graphicData uri="http://schemas.openxmlformats.org/drawingml/2006/picture">
-                <pic:pic xmlns:pic="http://schemas.openxmlformats.org/drawingml/2006/picture">
-                  <pic:nvPicPr>
-                    <pic:cNvPr id="0" name="figure-quarterly.png"/>
-                    <pic:cNvPicPr/>
-                  </pic:nvPicPr>
-                  <pic:blipFill>
-                    <a:blip r:embed="rId700"/>
-                    <a:stretch>
-                      <a:fillRect/>
-                    </a:stretch>
-                  </pic:blipFill>
-                  <pic:spPr>
-                    <a:xfrm>
-                      <a:off x="0" y="0"/>
-                      <a:ext cx="4572000" cy="2857500"/>
-                    </a:xfrm>
-                    <a:prstGeom prst="rect">
-                      <a:avLst/>
-                    </a:prstGeom>
-                  </pic:spPr>
-                </pic:pic>
-              </a:graphicData>
-            </a:graphic>
-          </wp:inline>
-        </w:drawing>
-      </w:r>
-    </w:p>
-    <w:p>
-      <w:pPr>
-        <w:jc w:val="center"/>
-        <w:spacing w:after="60"/>
-        <w:rPr>
-          <w:color w:val="657187"/>
-          <w:sz w:val="18"/>
-        </w:rPr>
-      </w:pPr>
-      <w:r>
-        <w:rPr>
-          <w:color w:val="657187"/>
-          <w:sz w:val="18"/>
-        </w:rPr>
-        <w:t xml:space="preserve">图 2 服务标识</w:t>
-      </w:r>
-    </w:p>
-    <w:p>
-      <w:pPr>
-        <w:jc w:val="center"/>
-        <w:spacing w:before="120" w:after="200"/>
-      </w:pPr>
-      <w:r>
-        <w:drawing>
-          <wp:inline xmlns:wp="http://schemas.openxmlformats.org/drawingml/2006/wordprocessingDrawing" distT="0" distB="0" distL="0" distR="0">
-            <wp:extent cx="1905000" cy="1905000"/>
-            <wp:docPr id="1601" name="figure-mark.png"/>
-            <a:graphic xmlns:a="http://schemas.openxmlformats.org/drawingml/2006/main">
-              <a:graphicData uri="http://schemas.openxmlformats.org/drawingml/2006/picture">
-                <pic:pic xmlns:pic="http://schemas.openxmlformats.org/drawingml/2006/picture">
-                  <pic:nvPicPr>
-                    <pic:cNvPr id="0" name="figure-mark.png"/>
-                    <pic:cNvPicPr/>
-                  </pic:nvPicPr>
-                  <pic:blipFill>
-                    <a:blip r:embed="rId701"/>
-                    <a:stretch>
-                      <a:fillRect/>
-                    </a:stretch>
-                  </pic:blipFill>
-                  <pic:spPr>
-                    <a:xfrm>
-                      <a:off x="0" y="0"/>
-                      <a:ext cx="1905000" cy="1905000"/>
-                    </a:xfrm>
-                    <a:prstGeom prst="rect">
-                      <a:avLst/>
-                    </a:prstGeom>
-                  </pic:spPr>
-                </pic:pic>
-              </a:graphicData>
-            </a:graphic>
-          </wp:inline>
-        </w:drawing>
-      </w:r>
-    </w:p>
-    <w:p>
-      <w:pPr>
-        <w:jc w:val="center"/>
-        <w:spacing w:after="60"/>
-        <w:rPr>
-          <w:color w:val="657187"/>
-          <w:sz w:val="18"/>
-        </w:rPr>
-      </w:pPr>
-      <w:r>
-        <w:rPr>
-          <w:color w:val="657187"/>
-          <w:sz w:val="18"/>
-        </w:rPr>
-        <w:t xml:space="preserve">图 3 验收流程</w:t>
-      </w:r>
-    </w:p>
-    <w:p>
-      <w:pPr>
-        <w:jc w:val="center"/>
-        <w:spacing w:before="120" w:after="200"/>
-      </w:pPr>
-      <w:r>
-        <w:drawing>
-          <wp:inline xmlns:wp="http://schemas.openxmlformats.org/drawingml/2006/wordprocessingDrawing" distT="0" distB="0" distL="0" distR="0">
-            <wp:extent cx="4572000" cy="1905000"/>
-            <wp:docPr id="1602" name="figure-flow.png"/>
-            <a:graphic xmlns:a="http://schemas.openxmlformats.org/drawingml/2006/main">
-              <a:graphicData uri="http://schemas.openxmlformats.org/drawingml/2006/picture">
-                <pic:pic xmlns:pic="http://schemas.openxmlformats.org/drawingml/2006/picture">
-                  <pic:nvPicPr>
-                    <pic:cNvPr id="0" name="figure-flow.png"/>
-                    <pic:cNvPicPr/>
-                  </pic:nvPicPr>
-                  <pic:blipFill>
-                    <a:blip r:embed="rId702"/>
-                    <a:stretch>
-                      <a:fillRect/>
-                    </a:stretch>
-                  </pic:blipFill>
-                  <pic:spPr>
-                    <a:xfrm>
-                      <a:off x="0" y="0"/>
-                      <a:ext cx="4572000" cy="1905000"/>
-                    </a:xfrm>
-                    <a:prstGeom prst="rect">
-                      <a:avLst/>
-                    </a:prstGeom>
-                  </pic:spPr>
-                </pic:pic>
-              </a:graphicData>
-            </a:graphic>
-          </wp:inline>
-        </w:drawing>
-      </w:r>
-    </w:p>
-    <w:p>
-      <w:pPr>
-        <w:jc w:val="center"/>
-        <w:spacing w:after="60"/>
-        <w:rPr>
-          <w:color w:val="657187"/>
-          <w:sz w:val="18"/>
-        </w:rPr>
-      </w:pPr>
-      <w:r>
-        <w:rPr>
-          <w:color w:val="657187"/>
-          <w:sz w:val="18"/>
-        </w:rPr>
-        <w:t xml:space="preserve">图 4 说明（Word 自绘文本框，不参与对比）</w:t>
-      </w:r>
-    </w:p>
-    <w:p>
-      <w:pPr>
-        <w:jc w:val="center"/>
-      </w:pPr>
-      <w:r>
-        <w:drawing>
-          <wp:inline xmlns:wp="http://schemas.openxmlformats.org/drawingml/2006/wordprocessingDrawing" distT="0" distB="0" distL="0" distR="0">
-            <wp:extent cx="3657600" cy="571500"/>
-            <wp:docPr id="960" name="TextBox 1"/>
-            <a:graphic xmlns:a="http://schemas.openxmlformats.org/drawingml/2006/main">
-              <a:graphicData uri="http://schemas.microsoft.com/office/word/2010/wordprocessingShape">
-                <wps:wsp xmlns:wps="http://schemas.microsoft.com/office/word/2010/wordprocessingShape">
-                  <wps:cNvSpPr txBox="1"/>
-                  <wps:spPr>
-                    <a:xfrm>
-                      <a:off x="0" y="0"/>
-                      <a:ext cx="3657600" cy="571500"/>
-                    </a:xfrm>
-                    <a:prstGeom prst="rect">
-                      <a:avLst/>
-                    </a:prstGeom>
-                  </wps:spPr>
-                  <wps:txbx>
-                    <w:txbxContent>
-                      <w:p>
-                        <w:r>
-                          <w:t xml:space="preserve">提示：本文本框由 Word 自行绘制</w:t>
-                        </w:r>
-                      </w:p>
-                    </w:txbxContent>
-                  </wps:txbx>
-                  <wps:bodyPr/>
-                </wps:wsp>
-              </a:graphicData>
-            </a:graphic>
-          </wp:inline>
-        </w:drawing>
-      </w:r>
-    </w:p>
-    <w:p>
-      <w:pPr>
-        <w:jc w:val="center"/>
-        <w:spacing w:after="60"/>
-        <w:rPr>
-          <w:color w:val="657187"/>
-          <w:sz w:val="18"/>
-        </w:rPr>
-      </w:pPr>
-      <w:r>
-        <w:rPr>
-          <w:color w:val="657187"/>
-          <w:sz w:val="18"/>
-        </w:rPr>
-        <w:t xml:space="preserve">式 1 面积（公式，不参与对比）</w:t>
-      </w:r>
-    </w:p>
-    <w:p>
-      <w:pPr>
-        <w:jc w:val="center"/>
-      </w:pPr>
-      <m:oMathPara xmlns:m="http://schemas.openxmlformats.org/officeDocument/2006/math">
-        <m:oMath>
-          <m:r>
-            <m:t xml:space="preserve">S = a × b ÷ 2</m:t>
-          </m:r>
-        </m:oMath>
-      </m:oMathPara>
+      </w:pPr>
+      <w:bookmarkStart w:id="9" w:name="DDPSample_6009"/>
+      <w:bookmarkStart w:id="10" w:name="_GoBack"/>
+      <w:bookmarkEnd w:id="10"/>
+      <w:r>
+        <mc:AlternateContent>
+          <mc:Choice Requires="wps">
+            <w:drawing>
+              <wp:inline distT="0" distB="0" distL="0" distR="0">
+                <wp:extent cx="4194175" cy="366395"/>
+                <wp:effectExtent l="0" t="0" r="0" b="0"/>
+                <wp:docPr id="960" name="TextBox 1"/>
+                <wp:cNvGraphicFramePr/>
+                <a:graphic xmlns:a="http://schemas.openxmlformats.org/drawingml/2006/main">
+                  <a:graphicData uri="http://schemas.microsoft.com/office/word/2010/wordprocessingShape">
+                    <wps:wsp>
+                      <wps:cNvSpPr txBox="1"/>
+                      <wps:spPr>
+                        <a:xfrm>
+                          <a:off x="0" y="0"/>
+                          <a:ext cx="4194175" cy="366395"/>
+                        </a:xfrm>
+                        <a:prstGeom prst="rect">
+                          <a:avLst/>
+                        </a:prstGeom>
+                      </wps:spPr>
+                      <wps:txbx>
+                        <w:txbxContent>
+                          <w:p>
+                            <w:r>
+                              <w:t>履约资料：源代码、部署包、测试报告与验收记录应完整归档。</w:t>
+                            </w:r>
+                          </w:p>
+                        </w:txbxContent>
+                      </wps:txbx>
+                      <wps:bodyPr/>
+                    </wps:wsp>
+                  </a:graphicData>
+                </a:graphic>
+              </wp:inline>
+            </w:drawing>
+          </mc:Choice>
+          <mc:Fallback>
+            <w:pict>
+              <v:shape id="TextBox 1" o:spid="_x0000_s1026" o:spt="202" type="#_x0000_t202" style="height:28.85pt;width:330.25pt;" filled="f" stroked="f" coordsize="21600,21600" o:gfxdata="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">
+                <v:fill on="f" focussize="0,0"/>
+                <v:stroke on="f"/>
+                <v:imagedata o:title=""/>
+                <o:lock v:ext="edit" aspectratio="f"/>
+                <v:textbox>
+                  <w:txbxContent>
+                    <w:p>
+                      <w:r>
+                        <w:t>履约资料：源代码、部署包、测试报告与验收记录应完整归档。</w:t>
+                      </w:r>
+                    </w:p>
+                  </w:txbxContent>
+                </v:textbox>
+                <w10:wrap type="none"/>
+                <w10:anchorlock/>
+              </v:shape>
+            </w:pict>
+          </mc:Fallback>
+        </mc:AlternateContent>
+      </w:r>
+      <w:bookmarkEnd w:id="9"/>
     </w:p>
     <w:sectPr>
       <w:headerReference r:id="rId5" w:type="default"/>
@@ -1950,7 +1982,7 @@
       <w:spacing w:line="360" w:lineRule="auto"/>
     </w:pPr>
     <w:rPr>
-      <w:rFonts w:ascii="Arial" w:hAnsi="Arial" w:eastAsia="PingFang SC"/>
+      <w:rFonts w:ascii="Arial" w:hAnsi="Arial" w:eastAsia="PingFang SC" w:cstheme="minorBidi"/>
       <w:sz w:val="22"/>
       <w:szCs w:val="22"/>
       <w:lang w:val="en-US" w:eastAsia="zh-CN"/>
@@ -2288,4 +2320,21 @@
   </a:themeElements>
   <a:objectDefaults/>
 </a:theme>
+</file>
+
+<file path=customXml/item1.xml><?xml version="1.0" encoding="utf-8"?>
+<s:customData xmlns="http://www.wps.cn/officeDocument/2013/wpsCustomData" xmlns:s="http://www.wps.cn/officeDocument/2013/wpsCustomData">
+  <customSectProps/>
+  <customShpExts>
+    <customShpInfo spid="_x0000_s1026" textRotate="1"/>
+  </customShpExts>
+</s:customData>
+</file>
+
+<file path=customXml/itemProps1.xml><?xml version="1.0" encoding="utf-8"?>
+<ds:datastoreItem xmlns:ds="http://schemas.openxmlformats.org/officeDocument/2006/customXml" ds:itemID="{B1977F7D-205B-4081-913C-38D41E755F92}">
+  <ds:schemaRefs>
+    <ds:schemaRef ds:uri="http://www.wps.cn/officeDocument/2013/wpsCustomData"/>
+  </ds:schemaRefs>
+</ds:datastoreItem>
 </file>
</xml_diff>